<commit_message>
Chora ko'rish: jarayon bosqichma-bosqich (asos → farmoyish/buyruq → ota-onaga xat)
- 1-bosqich — asos: talabaning tushuntirish xati (yuklash yoki «olindi»;
  yozmasa — dalolatnoma, faqat shu talabalar bilan) yoki kurs koordinatori
  bildirishnomasi (dekanga topshirilgan sana va raqam)
- 2-bosqich — dekan farmoyishi / universitet buyrug'i: 1-bosqichsiz
  chiqarilmaydi; «Asos:» qatori 1-bosqich hujjatlaridan (hayfsanda avvalgi
  farmoyish raqami ham) avtomatik yoziladi
- 3-bosqich — ota-onaga xat: farmoyish/buyruq raqami bilan, har bir xatning
  chiquvchi raqami va sanasi; ota-onalarga xabar va imzolangan xat PDF
  shu bosqichda yuboriladi
- «Hujjatlar» kartasi bosqichli, «Kurs holati»da jarayon zanjiri
  (chora kerak → asos → farmoyish/buyruq → xat → yakunlangan), tarixda va
  talaba oynasida har bir bosqich holati

Co-Authored-By: Claude Opus 5.5 <noreply@anthropic.com>
Claude-Session: https://claude.ai/code/session_012TXKedd4KpFfW3nF51yUhS
</commit_message>
<xml_diff>
--- a/shablonlar/chora/hayfsan_davomat.docx
+++ b/shablonlar/chora/hayfsan_davomat.docx
@@ -2131,7 +2131,7 @@
           <w:iCs/>
           <w:lang w:val="uz-Cyrl-UZ"/>
         </w:rPr>
-        <w:t xml:space="preserve">-bandi, 2025-yil 14-oktabrdagi “Jahon iqtisodiyoti va diplomatiya universitetining Odob-axloq Kodeksi, Ichki tartib-qoidalari (ichki mehnat tartibi), “Odob-axloq komissiyasi to‘g‘risida”gi Nizom va tarkibini tasdiqlash to‘g‘risida”gi 256-UM-sonli buyruq, dekan Farmoyishi,kurs koordinatori {{KOORDINATORLAR_NING}} bildirishnomasi</w:t>
+        <w:t xml:space="preserve">-bandi, 2025-yil 14-oktabrdagi “Jahon iqtisodiyoti va diplomatiya universitetining Odob-axloq Kodeksi, Ichki tartib-qoidalari (ichki mehnat tartibi), “Odob-axloq komissiyasi to‘g‘risida”gi Nizom va tarkibini tasdiqlash to‘g‘risida”gi 256-UM-sonli buyruq, {{ASOS}}, </w:t>
       </w:r>
       <w:r>
         <w:rPr>
@@ -2195,7 +2195,7 @@
           <w:iCs/>
           <w:lang w:val="uz-Cyrl-UZ"/>
         </w:rPr>
-        <w:t xml:space="preserve">,</w:t>
+        <w:t xml:space="preserve"/>
       </w:r>
       <w:r>
         <w:rPr>
@@ -2203,7 +2203,7 @@
           <w:iCs/>
           <w:lang w:val="uz-Cyrl-UZ"/>
         </w:rPr>
-        <w:t xml:space="preserve"> Talabaning darslarga kelmayotganiligi to‘g‘risidagi dalolatnoma, talabaning </w:t>
+        <w:t xml:space="preserve">Talabaning darslarga kelmayotganiligi to‘g‘risidagi dalolatnoma, talabaning </w:t>
       </w:r>
       <w:r>
         <w:rPr>

</xml_diff>